<commit_message>
Fill team members and faculty in project documentation
Co-Authored-By: Claude Sonnet 5.5 <noreply@anthropic.com>
</commit_message>
<xml_diff>
--- a/Project Documentation.docx
+++ b/Project Documentation.docx
@@ -103,7 +103,7 @@
           <w:szCs w:val="26"/>
           <w:highlight w:val="yellow"/>
         </w:rPr>
-        <w:t xml:space="preserve">[Student Name 1]</w:t>
+        <w:t xml:space="preserve">Pujith krishna soma</w:t>
       </w:r>
       <w:r>
         <w:rPr>
@@ -122,7 +122,7 @@
           <w:szCs w:val="26"/>
           <w:highlight w:val="yellow"/>
         </w:rPr>
-        <w:t xml:space="preserve">[Roll No. 1]</w:t>
+        <w:t xml:space="preserve">2420090069</w:t>
       </w:r>
       <w:r>
         <w:rPr>
@@ -147,7 +147,7 @@
           <w:szCs w:val="26"/>
           <w:highlight w:val="yellow"/>
         </w:rPr>
-        <w:t xml:space="preserve">[Student Name 2]</w:t>
+        <w:t xml:space="preserve">Ch. Bharath Varma</w:t>
       </w:r>
       <w:r>
         <w:rPr>
@@ -166,7 +166,7 @@
           <w:szCs w:val="26"/>
           <w:highlight w:val="yellow"/>
         </w:rPr>
-        <w:t xml:space="preserve">[Roll No. 2]</w:t>
+        <w:t xml:space="preserve">2420090068</w:t>
       </w:r>
     </w:p>
     <w:p>
@@ -182,7 +182,7 @@
           <w:szCs w:val="26"/>
           <w:highlight w:val="yellow"/>
         </w:rPr>
-        <w:t xml:space="preserve">[Student Name 3]</w:t>
+        <w:t xml:space="preserve">Y Sriram</w:t>
       </w:r>
       <w:r>
         <w:rPr>
@@ -201,7 +201,7 @@
           <w:szCs w:val="26"/>
           <w:highlight w:val="yellow"/>
         </w:rPr>
-        <w:t xml:space="preserve">[Roll No. 3]</w:t>
+        <w:t xml:space="preserve">2420090148</w:t>
       </w:r>
     </w:p>
     <w:p>
@@ -217,7 +217,7 @@
           <w:szCs w:val="26"/>
           <w:highlight w:val="yellow"/>
         </w:rPr>
-        <w:t xml:space="preserve">[Student Name 4]</w:t>
+        <w:t xml:space="preserve">R Sai Sidhartha</w:t>
       </w:r>
       <w:r>
         <w:rPr>
@@ -236,7 +236,7 @@
           <w:szCs w:val="26"/>
           <w:highlight w:val="yellow"/>
         </w:rPr>
-        <w:t xml:space="preserve">[Roll No. 4]</w:t>
+        <w:t xml:space="preserve">2400032486</w:t>
       </w:r>
     </w:p>
     <w:p>
@@ -267,7 +267,7 @@
           <w:szCs w:val="26"/>
           <w:highlight w:val="yellow"/>
         </w:rPr>
-        <w:t xml:space="preserve">[Name of the SOA Faculty]</w:t>
+        <w:t xml:space="preserve">Ms Navyatha Ravi</w:t>
       </w:r>
     </w:p>
     <w:p>
@@ -468,7 +468,7 @@
         <w:rPr>
           <w:highlight w:val="yellow"/>
         </w:rPr>
-        <w:t xml:space="preserve">[Student Name 1]</w:t>
+        <w:t xml:space="preserve">Pujith krishna soma</w:t>
       </w:r>
       <w:r>
         <w:t xml:space="preserve"> – </w:t>
@@ -477,7 +477,7 @@
         <w:rPr>
           <w:highlight w:val="yellow"/>
         </w:rPr>
-        <w:t xml:space="preserve">[Roll No. 1]</w:t>
+        <w:t xml:space="preserve">2420090069</w:t>
       </w:r>
       <w:r>
         <w:t xml:space="preserve">, </w:t>
@@ -486,7 +486,7 @@
         <w:rPr>
           <w:highlight w:val="yellow"/>
         </w:rPr>
-        <w:t xml:space="preserve">[Student Name 2]</w:t>
+        <w:t xml:space="preserve">Ch. Bharath Varma</w:t>
       </w:r>
       <w:r>
         <w:t xml:space="preserve"> – </w:t>
@@ -495,7 +495,7 @@
         <w:rPr>
           <w:highlight w:val="yellow"/>
         </w:rPr>
-        <w:t xml:space="preserve">[Roll No. 2]</w:t>
+        <w:t xml:space="preserve">2420090068</w:t>
       </w:r>
       <w:r>
         <w:t xml:space="preserve">, </w:t>
@@ -504,7 +504,7 @@
         <w:rPr>
           <w:highlight w:val="yellow"/>
         </w:rPr>
-        <w:t xml:space="preserve">[Student Name 3]</w:t>
+        <w:t xml:space="preserve">Y Sriram</w:t>
       </w:r>
       <w:r>
         <w:t xml:space="preserve"> – </w:t>
@@ -513,7 +513,7 @@
         <w:rPr>
           <w:highlight w:val="yellow"/>
         </w:rPr>
-        <w:t xml:space="preserve">[Roll No. 3]</w:t>
+        <w:t xml:space="preserve">2420090148</w:t>
       </w:r>
       <w:r>
         <w:t xml:space="preserve">, </w:t>
@@ -522,7 +522,7 @@
         <w:rPr>
           <w:highlight w:val="yellow"/>
         </w:rPr>
-        <w:t xml:space="preserve">[Student Name 4]</w:t>
+        <w:t xml:space="preserve">R Sai Sidhartha</w:t>
       </w:r>
       <w:r>
         <w:t xml:space="preserve"> – </w:t>
@@ -531,7 +531,7 @@
         <w:rPr>
           <w:highlight w:val="yellow"/>
         </w:rPr>
-        <w:t xml:space="preserve">[Roll No. 4]</w:t>
+        <w:t xml:space="preserve">2400032486</w:t>
       </w:r>
       <w:r>
         <w:t xml:space="preserve"> submitted in partial fulfillment for the award of B.Tech in Computer Science and Engineering to the K L (Deemed to be) University. The results embodied in this report have not been copied from any other departments/University/Institute.</w:t>
@@ -555,7 +555,7 @@
           <w:szCs w:val="24"/>
           <w:highlight w:val="yellow"/>
         </w:rPr>
-        <w:t xml:space="preserve">[Student Name 1]</w:t>
+        <w:t xml:space="preserve">Pujith krishna soma</w:t>
       </w:r>
       <w:r>
         <w:rPr>
@@ -574,7 +574,7 @@
           <w:szCs w:val="24"/>
           <w:highlight w:val="yellow"/>
         </w:rPr>
-        <w:t xml:space="preserve">[Roll No. 1]</w:t>
+        <w:t xml:space="preserve">2420090069</w:t>
       </w:r>
     </w:p>
     <w:p>
@@ -590,7 +590,7 @@
           <w:szCs w:val="24"/>
           <w:highlight w:val="yellow"/>
         </w:rPr>
-        <w:t xml:space="preserve">[Student Name 2]</w:t>
+        <w:t xml:space="preserve">Ch. Bharath Varma</w:t>
       </w:r>
       <w:r>
         <w:rPr>
@@ -609,7 +609,7 @@
           <w:szCs w:val="24"/>
           <w:highlight w:val="yellow"/>
         </w:rPr>
-        <w:t xml:space="preserve">[Roll No. 2]</w:t>
+        <w:t xml:space="preserve">2420090068</w:t>
       </w:r>
     </w:p>
     <w:p>
@@ -625,7 +625,7 @@
           <w:szCs w:val="24"/>
           <w:highlight w:val="yellow"/>
         </w:rPr>
-        <w:t xml:space="preserve">[Student Name 3]</w:t>
+        <w:t xml:space="preserve">Y Sriram</w:t>
       </w:r>
       <w:r>
         <w:rPr>
@@ -644,7 +644,7 @@
           <w:szCs w:val="24"/>
           <w:highlight w:val="yellow"/>
         </w:rPr>
-        <w:t xml:space="preserve">[Roll No. 3]</w:t>
+        <w:t xml:space="preserve">2420090148</w:t>
       </w:r>
     </w:p>
     <w:p>
@@ -660,7 +660,7 @@
           <w:szCs w:val="24"/>
           <w:highlight w:val="yellow"/>
         </w:rPr>
-        <w:t xml:space="preserve">[Student Name 4]</w:t>
+        <w:t xml:space="preserve">R Sai Sidhartha</w:t>
       </w:r>
       <w:r>
         <w:rPr>
@@ -679,7 +679,7 @@
           <w:szCs w:val="24"/>
           <w:highlight w:val="yellow"/>
         </w:rPr>
-        <w:t xml:space="preserve">[Roll No. 4]</w:t>
+        <w:t xml:space="preserve">2400032486</w:t>
       </w:r>
     </w:p>
     <w:p>
@@ -788,7 +788,7 @@
         <w:rPr>
           <w:highlight w:val="yellow"/>
         </w:rPr>
-        <w:t xml:space="preserve">[Student Name 1]</w:t>
+        <w:t xml:space="preserve">Pujith krishna soma</w:t>
       </w:r>
       <w:r>
         <w:t xml:space="preserve"> – </w:t>
@@ -797,7 +797,7 @@
         <w:rPr>
           <w:highlight w:val="yellow"/>
         </w:rPr>
-        <w:t xml:space="preserve">[Roll No. 1]</w:t>
+        <w:t xml:space="preserve">2420090069</w:t>
       </w:r>
       <w:r>
         <w:t xml:space="preserve">, </w:t>
@@ -806,7 +806,7 @@
         <w:rPr>
           <w:highlight w:val="yellow"/>
         </w:rPr>
-        <w:t xml:space="preserve">[Student Name 2]</w:t>
+        <w:t xml:space="preserve">Ch. Bharath Varma</w:t>
       </w:r>
       <w:r>
         <w:t xml:space="preserve"> – </w:t>
@@ -815,7 +815,7 @@
         <w:rPr>
           <w:highlight w:val="yellow"/>
         </w:rPr>
-        <w:t xml:space="preserve">[Roll No. 2]</w:t>
+        <w:t xml:space="preserve">2420090068</w:t>
       </w:r>
       <w:r>
         <w:t xml:space="preserve">, </w:t>
@@ -824,7 +824,7 @@
         <w:rPr>
           <w:highlight w:val="yellow"/>
         </w:rPr>
-        <w:t xml:space="preserve">[Student Name 3]</w:t>
+        <w:t xml:space="preserve">Y Sriram</w:t>
       </w:r>
       <w:r>
         <w:t xml:space="preserve"> – </w:t>
@@ -833,7 +833,7 @@
         <w:rPr>
           <w:highlight w:val="yellow"/>
         </w:rPr>
-        <w:t xml:space="preserve">[Roll No. 3]</w:t>
+        <w:t xml:space="preserve">2420090148</w:t>
       </w:r>
       <w:r>
         <w:t xml:space="preserve">, </w:t>
@@ -842,7 +842,7 @@
         <w:rPr>
           <w:highlight w:val="yellow"/>
         </w:rPr>
-        <w:t xml:space="preserve">[Student Name 4]</w:t>
+        <w:t xml:space="preserve">R Sai Sidhartha</w:t>
       </w:r>
       <w:r>
         <w:t xml:space="preserve"> – </w:t>
@@ -851,7 +851,7 @@
         <w:rPr>
           <w:highlight w:val="yellow"/>
         </w:rPr>
-        <w:t xml:space="preserve">[Roll No. 4]</w:t>
+        <w:t xml:space="preserve">2400032486</w:t>
       </w:r>
       <w:r>
         <w:t xml:space="preserve"> in partial fulfillment of the requirements for the award of the degree of BACHELOR OF TECHNOLOGY in Computer Science and Engineering, K L (Deemed to be University), during the academic year 2026-2027.</w:t>
@@ -981,7 +981,7 @@
         <w:rPr>
           <w:highlight w:val="yellow"/>
         </w:rPr>
-        <w:t xml:space="preserve">[Name of the SOA Faculty]</w:t>
+        <w:t xml:space="preserve">Ms Navyatha Ravi</w:t>
       </w:r>
       <w:r>
         <w:t xml:space="preserve">, Department of Computer Science, whose tremendous support, encouragement and guidance for this project cannot be expressed in words.</w:t>
@@ -1027,7 +1027,7 @@
           <w:szCs w:val="24"/>
           <w:highlight w:val="yellow"/>
         </w:rPr>
-        <w:t xml:space="preserve">[Student Name 1]</w:t>
+        <w:t xml:space="preserve">Pujith krishna soma</w:t>
       </w:r>
       <w:r>
         <w:rPr>
@@ -1046,7 +1046,7 @@
           <w:szCs w:val="24"/>
           <w:highlight w:val="yellow"/>
         </w:rPr>
-        <w:t xml:space="preserve">[Roll No. 1]</w:t>
+        <w:t xml:space="preserve">2420090069</w:t>
       </w:r>
     </w:p>
     <w:p>
@@ -1062,7 +1062,7 @@
           <w:szCs w:val="24"/>
           <w:highlight w:val="yellow"/>
         </w:rPr>
-        <w:t xml:space="preserve">[Student Name 2]</w:t>
+        <w:t xml:space="preserve">Ch. Bharath Varma</w:t>
       </w:r>
       <w:r>
         <w:rPr>
@@ -1081,7 +1081,7 @@
           <w:szCs w:val="24"/>
           <w:highlight w:val="yellow"/>
         </w:rPr>
-        <w:t xml:space="preserve">[Roll No. 2]</w:t>
+        <w:t xml:space="preserve">2420090068</w:t>
       </w:r>
     </w:p>
     <w:p>
@@ -1097,7 +1097,7 @@
           <w:szCs w:val="24"/>
           <w:highlight w:val="yellow"/>
         </w:rPr>
-        <w:t xml:space="preserve">[Student Name 3]</w:t>
+        <w:t xml:space="preserve">Y Sriram</w:t>
       </w:r>
       <w:r>
         <w:rPr>
@@ -1116,7 +1116,7 @@
           <w:szCs w:val="24"/>
           <w:highlight w:val="yellow"/>
         </w:rPr>
-        <w:t xml:space="preserve">[Roll No. 3]</w:t>
+        <w:t xml:space="preserve">2420090148</w:t>
       </w:r>
     </w:p>
     <w:p>
@@ -1132,7 +1132,7 @@
           <w:szCs w:val="24"/>
           <w:highlight w:val="yellow"/>
         </w:rPr>
-        <w:t xml:space="preserve">[Student Name 4]</w:t>
+        <w:t xml:space="preserve">R Sai Sidhartha</w:t>
       </w:r>
       <w:r>
         <w:rPr>
@@ -1151,7 +1151,7 @@
           <w:szCs w:val="24"/>
           <w:highlight w:val="yellow"/>
         </w:rPr>
-        <w:t xml:space="preserve">[Roll No. 4]</w:t>
+        <w:t xml:space="preserve">2400032486</w:t>
       </w:r>
     </w:p>
     <w:p>
@@ -4291,7 +4291,7 @@
                 <w:szCs w:val="21"/>
                 <w:highlight w:val="yellow"/>
               </w:rPr>
-              <w:t xml:space="preserve">[Student Name 1]</w:t>
+              <w:t xml:space="preserve">Pujith krishna soma</w:t>
             </w:r>
             <w:r>
               <w:rPr>
@@ -4306,7 +4306,7 @@
                 <w:szCs w:val="21"/>
                 <w:highlight w:val="yellow"/>
               </w:rPr>
-              <w:t xml:space="preserve">[Roll No. 1]</w:t>
+              <w:t xml:space="preserve">2420090069</w:t>
             </w:r>
             <w:r>
               <w:rPr>
@@ -4397,7 +4397,7 @@
                 <w:szCs w:val="21"/>
                 <w:highlight w:val="yellow"/>
               </w:rPr>
-              <w:t xml:space="preserve">[Student Name 2]</w:t>
+              <w:t xml:space="preserve">Ch. Bharath Varma</w:t>
             </w:r>
             <w:r>
               <w:rPr>
@@ -4412,7 +4412,7 @@
                 <w:szCs w:val="21"/>
                 <w:highlight w:val="yellow"/>
               </w:rPr>
-              <w:t xml:space="preserve">[Roll No. 2]</w:t>
+              <w:t xml:space="preserve">2420090068</w:t>
             </w:r>
             <w:r>
               <w:rPr>
@@ -4502,7 +4502,7 @@
                 <w:szCs w:val="21"/>
                 <w:highlight w:val="yellow"/>
               </w:rPr>
-              <w:t xml:space="preserve">[Student Name 3]</w:t>
+              <w:t xml:space="preserve">Y Sriram</w:t>
             </w:r>
             <w:r>
               <w:rPr>
@@ -4517,7 +4517,7 @@
                 <w:szCs w:val="21"/>
                 <w:highlight w:val="yellow"/>
               </w:rPr>
-              <w:t xml:space="preserve">[Roll No. 3]</w:t>
+              <w:t xml:space="preserve">2420090148</w:t>
             </w:r>
             <w:r>
               <w:rPr>
@@ -4607,7 +4607,7 @@
                 <w:szCs w:val="21"/>
                 <w:highlight w:val="yellow"/>
               </w:rPr>
-              <w:t xml:space="preserve">[Student Name 4]</w:t>
+              <w:t xml:space="preserve">R Sai Sidhartha</w:t>
             </w:r>
             <w:r>
               <w:rPr>
@@ -4622,7 +4622,7 @@
                 <w:szCs w:val="21"/>
                 <w:highlight w:val="yellow"/>
               </w:rPr>
-              <w:t xml:space="preserve">[Roll No. 4]</w:t>
+              <w:t xml:space="preserve">2400032486</w:t>
             </w:r>
             <w:r>
               <w:rPr>

</xml_diff>

<commit_message>
Rename project to College Canteen Pre-Ordering App in Project Documentation.docx
Co-Authored-By: Claude Sonnet 5.5 <noreply@anthropic.com>
</commit_message>
<xml_diff>
--- a/Project Documentation.docx
+++ b/Project Documentation.docx
@@ -14,7 +14,7 @@
           <w:sz w:val="36"/>
           <w:szCs w:val="36"/>
         </w:rPr>
-        <w:t xml:space="preserve">KLH PANTRY APP: A REAL-TIME CAMPUS CANTEEN ORDERING AND MANAGEMENT SYSTEM</w:t>
+        <w:t xml:space="preserve">COLLEGE CANTEEN PRE-ORDERING APP: A REAL-TIME CAMPUS CANTEEN ORDERING AND MANAGEMENT SYSTEM</w:t>
       </w:r>
     </w:p>
     <w:p>
@@ -462,7 +462,7 @@
         <w:jc w:val="both"/>
       </w:pPr>
       <w:r>
-        <w:t xml:space="preserve">The Mini Project Report entitled “KLH Pantry App: A Real-Time Campus Canteen Ordering and Management System” is a record of Bonafide work of </w:t>
+        <w:t xml:space="preserve">The Mini Project Report entitled “College Canteen Pre-Ordering App: A Real-Time Campus Canteen Ordering and Management System” is a record of Bonafide work of </w:t>
       </w:r>
       <w:r>
         <w:rPr>
@@ -782,7 +782,7 @@
         <w:jc w:val="both"/>
       </w:pPr>
       <w:r>
-        <w:t xml:space="preserve">This is to certify that the mini project based report entitled “KLH Pantry App: A Real-Time Campus Canteen Ordering and Management System” is a bonafide work done and submitted by </w:t>
+        <w:t xml:space="preserve">This is to certify that the mini project based report entitled “College Canteen Pre-Ordering App: A Real-Time Campus Canteen Ordering and Management System” is a bonafide work done and submitted by </w:t>
       </w:r>
       <w:r>
         <w:rPr>
@@ -4060,7 +4060,7 @@
           <w:b/>
           <w:bCs/>
         </w:rPr>
-        <w:t xml:space="preserve">KLH Pantry App</w:t>
+        <w:t xml:space="preserve">College Canteen Pre-Ordering App</w:t>
       </w:r>
       <w:r>
         <w:t xml:space="preserve">, deployed as the </w:t>
@@ -6506,7 +6506,7 @@
                 <w:sz w:val="21"/>
                 <w:szCs w:val="21"/>
               </w:rPr>
-              <w:t xml:space="preserve">KLH Pantry App</w:t>
+              <w:t xml:space="preserve">College Canteen Pre-Ordering App</w:t>
             </w:r>
           </w:p>
         </w:tc>
@@ -9706,7 +9706,7 @@
           <wp:inline distT="0" distB="0" distL="0" distR="0">
             <wp:extent cx="5943600" cy="3685032"/>
             <wp:effectExtent l="0" t="0" r="0" b="0"/>
-            <wp:docPr id="6" name="Picture 6" descr="System architecture of the KLH Pantry App"/>
+            <wp:docPr id="6" name="Picture 6" descr="System architecture of the College Canteen Pre-Ordering App"/>
             <wp:cNvGraphicFramePr>
               <a:graphicFrameLocks xmlns:a="http://schemas.openxmlformats.org/drawingml/2006/main" noChangeAspect="1"/>
             </wp:cNvGraphicFramePr>
@@ -9714,7 +9714,7 @@
               <a:graphicData uri="http://schemas.openxmlformats.org/drawingml/2006/picture">
                 <pic:pic xmlns:pic="http://schemas.openxmlformats.org/drawingml/2006/picture">
                   <pic:nvPicPr>
-                    <pic:cNvPr id="6" name="fig_architecture.png" descr="System architecture of the KLH Pantry App"/>
+                    <pic:cNvPr id="6" name="fig_architecture.png" descr="System architecture of the College Canteen Pre-Ordering App"/>
                     <pic:cNvPicPr/>
                   </pic:nvPicPr>
                   <pic:blipFill>
@@ -9753,7 +9753,7 @@
           <w:sz w:val="22"/>
           <w:szCs w:val="22"/>
         </w:rPr>
-        <w:t xml:space="preserve">Figure 6.1: System architecture of the KLH Pantry App</w:t>
+        <w:t xml:space="preserve">Figure 6.1: System architecture of the College Canteen Pre-Ordering App</w:t>
       </w:r>
     </w:p>
     <w:p>
@@ -22602,7 +22602,7 @@
         <w:jc w:val="both"/>
       </w:pPr>
       <w:r>
-        <w:t xml:space="preserve">The KLH Pantry App meets the objectives set at the start of the project. Students can order from a live, school-specific menu on their phones and collect food with a short token; stock is reserved atomically so that no item is sold twice; payments release food only after the gateway has independently confirmed the money; and kitchen staff, administrators and super admins each work in an interface that updates in real time. The platform is deployed on a serverless stack, protected by identity-based rate limiting, role checks and an audit trail, and verified by 485 automated tests.</w:t>
+        <w:t xml:space="preserve">The College Canteen Pre-Ordering App meets the objectives set at the start of the project. Students can order from a live, school-specific menu on their phones and collect food with a short token; stock is reserved atomically so that no item is sold twice; payments release food only after the gateway has independently confirmed the money; and kitchen staff, administrators and super admins each work in an interface that updates in real time. The platform is deployed on a serverless stack, protected by identity-based rate limiting, role checks and an audit trail, and verified by 485 automated tests.</w:t>
       </w:r>
     </w:p>
     <w:p>

</xml_diff>

<commit_message>
Finish folder rename: update remaining path references
Co-Authored-By: Claude Sonnet 5.5 <noreply@anthropic.com>
</commit_message>
<xml_diff>
--- a/Project Documentation.docx
+++ b/Project Documentation.docx
@@ -10741,7 +10741,7 @@
           <w:sz w:val="19"/>
           <w:szCs w:val="19"/>
         </w:rPr>
-        <w:t xml:space="preserve">klh-canteen-backend/src/db/sql.ts  (lines 26-42)</w:t>
+        <w:t xml:space="preserve">backend/src/db/sql.ts  (lines 26-42)</w:t>
       </w:r>
     </w:p>
     <w:p>
@@ -13167,7 +13167,7 @@
           <w:sz w:val="19"/>
           <w:szCs w:val="19"/>
         </w:rPr>
-        <w:t xml:space="preserve">klh-canteen-backend/src/app.ts  (lines 59-59, 70-70, 75-78, 85-94)</w:t>
+        <w:t xml:space="preserve">backend/src/app.ts  (lines 59-59, 70-70, 75-78, 85-94)</w:t>
       </w:r>
     </w:p>
     <w:p>
@@ -13640,7 +13640,7 @@
           <w:sz w:val="19"/>
           <w:szCs w:val="19"/>
         </w:rPr>
-        <w:t xml:space="preserve">klh-canteen-backend/src/middleware/auth.ts  (lines 103-115)</w:t>
+        <w:t xml:space="preserve">backend/src/middleware/auth.ts  (lines 103-115)</w:t>
       </w:r>
     </w:p>
     <w:p>
@@ -14001,7 +14001,7 @@
           <w:sz w:val="19"/>
           <w:szCs w:val="19"/>
         </w:rPr>
-        <w:t xml:space="preserve">klh-canteen-backend/src/services/orderService.ts  (lines 171-186)</w:t>
+        <w:t xml:space="preserve">backend/src/services/orderService.ts  (lines 171-186)</w:t>
       </w:r>
     </w:p>
     <w:p>
@@ -14383,7 +14383,7 @@
           <w:sz w:val="19"/>
           <w:szCs w:val="19"/>
         </w:rPr>
-        <w:t xml:space="preserve">klh-canteen-backend/src/services/orderService.ts  (lines 1297-1301)</w:t>
+        <w:t xml:space="preserve">backend/src/services/orderService.ts  (lines 1297-1301)</w:t>
       </w:r>
     </w:p>
     <w:p>
@@ -14562,7 +14562,7 @@
           <w:sz w:val="19"/>
           <w:szCs w:val="19"/>
         </w:rPr>
-        <w:t xml:space="preserve">klh-canteen-backend/src/services/paymentService.ts  (excerpt: the gateway answer replaces the payload)</w:t>
+        <w:t xml:space="preserve">backend/src/services/paymentService.ts  (excerpt: the gateway answer replaces the payload)</w:t>
       </w:r>
     </w:p>
     <w:p>
@@ -14930,7 +14930,7 @@
           <w:sz w:val="19"/>
           <w:szCs w:val="19"/>
         </w:rPr>
-        <w:t xml:space="preserve">klh-canteen-backend/src/middleware/rateLimit.ts  (lines 186-192)</w:t>
+        <w:t xml:space="preserve">backend/src/middleware/rateLimit.ts  (lines 186-192)</w:t>
       </w:r>
     </w:p>
     <w:p>
@@ -15324,7 +15324,7 @@
           <w:sz w:val="19"/>
           <w:szCs w:val="19"/>
         </w:rPr>
-        <w:t xml:space="preserve">klh-canteen-backend/src/lib/realtime.ts  (lines 66-75)</w:t>
+        <w:t xml:space="preserve">backend/src/lib/realtime.ts  (lines 66-75)</w:t>
       </w:r>
     </w:p>
     <w:p>
@@ -15551,7 +15551,7 @@
           <w:sz w:val="19"/>
           <w:szCs w:val="19"/>
         </w:rPr>
-        <w:t xml:space="preserve">klh-canteen-backend/wrangler.jsonc  (Durable Object bindings)</w:t>
+        <w:t xml:space="preserve">backend/wrangler.jsonc  (Durable Object bindings)</w:t>
       </w:r>
     </w:p>
     <w:p>
@@ -17744,7 +17744,7 @@
           <w:sz w:val="19"/>
           <w:szCs w:val="19"/>
         </w:rPr>
-        <w:t xml:space="preserve">klh-canteen-frontend/src/App.tsx  (lines 85-91, 101-109)</w:t>
+        <w:t xml:space="preserve">frontend/src/App.tsx  (lines 85-91, 101-109)</w:t>
       </w:r>
     </w:p>
     <w:p>
@@ -18126,7 +18126,7 @@
           <w:sz w:val="19"/>
           <w:szCs w:val="19"/>
         </w:rPr>
-        <w:t xml:space="preserve">klh-canteen-frontend/src/lib/landing.ts  (lines 9-19)</w:t>
+        <w:t xml:space="preserve">frontend/src/lib/landing.ts  (lines 9-19)</w:t>
       </w:r>
     </w:p>
     <w:p>
@@ -18464,7 +18464,7 @@
           <w:sz w:val="19"/>
           <w:szCs w:val="19"/>
         </w:rPr>
-        <w:t xml:space="preserve">klh-canteen-frontend/src/lib/apiClient.ts  (lines 60-66)</w:t>
+        <w:t xml:space="preserve">frontend/src/lib/apiClient.ts  (lines 60-66)</w:t>
       </w:r>
     </w:p>
     <w:p>
@@ -18628,7 +18628,7 @@
           <w:sz w:val="19"/>
           <w:szCs w:val="19"/>
         </w:rPr>
-        <w:t xml:space="preserve">klh-canteen-frontend/src/context/CartContext.tsx  (lines 39-46)</w:t>
+        <w:t xml:space="preserve">frontend/src/context/CartContext.tsx  (lines 39-46)</w:t>
       </w:r>
     </w:p>
     <w:p>
@@ -18922,7 +18922,7 @@
           <w:sz w:val="19"/>
           <w:szCs w:val="19"/>
         </w:rPr>
-        <w:t xml:space="preserve">klh-canteen-frontend/src/hooks/useSSE.ts  (lines 158-167)</w:t>
+        <w:t xml:space="preserve">frontend/src/hooks/useSSE.ts  (lines 158-167)</w:t>
       </w:r>
     </w:p>
     <w:p>

</xml_diff>